<commit_message>
Add Ideas page with full CRUD, filters, tags, and API docs update
- consultancy_ideas table (status, priority, category, color, tags, pinned)
- GET/POST/DELETE /api/ideas and PATCH/DELETE /api/ideas/:id
- Ideas page: card grid, status/category filters, fullscreen editor, auto-save
- Ideas link added to Nav
- API_Documentation.docx updated with Section 8 (Ideas)

Co-Authored-By: Claude Sonnet 4.6 <noreply@anthropic.com>
</commit_message>
<xml_diff>
--- a/API_Documentation.docx
+++ b/API_Documentation.docx
@@ -7067,7 +7067,20 @@
         </w:rPr>
       </w:pPr>
       <w:r>
-        <w:t xml:space="preserve">8. Services</w:t>
+        <w:t xml:space="preserve">8. Ideas</w:t>
+      </w:r>
+    </w:p>
+    <w:p>
+      <w:pPr>
+        <w:spacing w:after="80" w:before="40"/>
+      </w:pPr>
+      <w:r>
+        <w:rPr>
+          <w:color w:val="374151"/>
+          <w:sz w:val="20"/>
+          <w:szCs w:val="20"/>
+        </w:rPr>
+        <w:t xml:space="preserve">Fully customizable idea board with status, priority, category, tags, color, and pin support.</w:t>
       </w:r>
     </w:p>
     <w:p>
@@ -7079,7 +7092,7 @@
         </w:rPr>
       </w:pPr>
       <w:r>
-        <w:t xml:space="preserve">List / Create / Update / Delete</w:t>
+        <w:t xml:space="preserve">List ideas</w:t>
       </w:r>
     </w:p>
     <w:p>
@@ -7104,82 +7117,35 @@
           <w:sz w:val="20"/>
           <w:szCs w:val="20"/>
         </w:rPr>
-        <w:t xml:space="preserve">  /api/services</w:t>
-      </w:r>
-    </w:p>
-    <w:p>
-      <w:pPr>
-        <w:spacing w:after="80" w:before="160"/>
+        <w:t xml:space="preserve">  /api/ideas</w:t>
+      </w:r>
+    </w:p>
+    <w:p>
+      <w:pPr>
+        <w:spacing w:after="80" w:before="40"/>
+      </w:pPr>
+      <w:r>
+        <w:rPr>
+          <w:color w:val="374151"/>
+          <w:sz w:val="20"/>
+          <w:szCs w:val="20"/>
+        </w:rPr>
+        <w:t xml:space="preserve">Returns all ideas ordered by pinned desc, then updatedAt desc.</w:t>
+      </w:r>
+    </w:p>
+    <w:p>
+      <w:pPr>
+        <w:spacing w:after="80" w:before="240"/>
       </w:pPr>
       <w:r>
         <w:rPr>
           <w:b/>
           <w:bCs/>
-          <w:color w:val="FFFFFF"/>
-          <w:sz w:val="18"/>
-          <w:szCs w:val="18"/>
-          <w:shd w:color="2563EB" w:val="solid"/>
-        </w:rPr>
-        <w:t xml:space="preserve"> POST </w:t>
-      </w:r>
-      <w:r>
-        <w:rPr>
-          <w:rFonts w:ascii="Courier New" w:cs="Courier New" w:eastAsia="Courier New" w:hAnsi="Courier New"/>
           <w:color w:val="1E1E2E"/>
-          <w:sz w:val="20"/>
-          <w:szCs w:val="20"/>
-        </w:rPr>
-        <w:t xml:space="preserve">  /api/services</w:t>
-      </w:r>
-    </w:p>
-    <w:p>
-      <w:pPr>
-        <w:spacing w:after="80" w:before="160"/>
-      </w:pPr>
-      <w:r>
-        <w:rPr>
-          <w:b/>
-          <w:bCs/>
-          <w:color w:val="FFFFFF"/>
-          <w:sz w:val="18"/>
-          <w:szCs w:val="18"/>
-          <w:shd w:color="D97706" w:val="solid"/>
-        </w:rPr>
-        <w:t xml:space="preserve"> PATCH </w:t>
-      </w:r>
-      <w:r>
-        <w:rPr>
-          <w:rFonts w:ascii="Courier New" w:cs="Courier New" w:eastAsia="Courier New" w:hAnsi="Courier New"/>
-          <w:color w:val="1E1E2E"/>
-          <w:sz w:val="20"/>
-          <w:szCs w:val="20"/>
-        </w:rPr>
-        <w:t xml:space="preserve">  /api/services/:id</w:t>
-      </w:r>
-    </w:p>
-    <w:p>
-      <w:pPr>
-        <w:spacing w:after="80" w:before="160"/>
-      </w:pPr>
-      <w:r>
-        <w:rPr>
-          <w:b/>
-          <w:bCs/>
-          <w:color w:val="FFFFFF"/>
-          <w:sz w:val="18"/>
-          <w:szCs w:val="18"/>
-          <w:shd w:color="DC2626" w:val="solid"/>
-        </w:rPr>
-        <w:t xml:space="preserve"> DELETE </w:t>
-      </w:r>
-      <w:r>
-        <w:rPr>
-          <w:rFonts w:ascii="Courier New" w:cs="Courier New" w:eastAsia="Courier New" w:hAnsi="Courier New"/>
-          <w:color w:val="1E1E2E"/>
-          <w:sz w:val="20"/>
-          <w:szCs w:val="20"/>
-        </w:rPr>
-        <w:t xml:space="preserve">  /api/services/:id</w:t>
+          <w:sz w:val="22"/>
+          <w:szCs w:val="22"/>
+        </w:rPr>
+        <w:t xml:space="preserve">Query parameters</w:t>
       </w:r>
     </w:p>
     <w:tbl>
@@ -7315,7 +7281,7 @@
                 <w:sz w:val="18"/>
                 <w:szCs w:val="18"/>
               </w:rPr>
-              <w:t xml:space="preserve">`name`</w:t>
+              <w:t xml:space="preserve">`category`</w:t>
             </w:r>
           </w:p>
         </w:tc>
@@ -7357,28 +7323,28 @@
                 <w:sz w:val="18"/>
                 <w:szCs w:val="18"/>
               </w:rPr>
-              <w:t xml:space="preserve">Yes</w:t>
-            </w:r>
-          </w:p>
-        </w:tc>
-        <w:tc>
-          <w:tcPr>
-            <w:shd w:color="F9FAFB" w:val="solid"/>
-            <w:tcMar>
-              <w:top w:type="dxa" w:w="60"/>
-              <w:left w:type="dxa" w:w="100"/>
-              <w:bottom w:type="dxa" w:w="60"/>
-              <w:right w:type="dxa" w:w="100"/>
-            </w:tcMar>
-          </w:tcPr>
-          <w:p>
-            <w:r>
-              <w:rPr>
-                <w:color w:val="1E1E2E"/>
-                <w:sz w:val="18"/>
-                <w:szCs w:val="18"/>
-              </w:rPr>
-              <w:t xml:space="preserve">Service name</w:t>
+              <w:t xml:space="preserve">No</w:t>
+            </w:r>
+          </w:p>
+        </w:tc>
+        <w:tc>
+          <w:tcPr>
+            <w:shd w:color="F9FAFB" w:val="solid"/>
+            <w:tcMar>
+              <w:top w:type="dxa" w:w="60"/>
+              <w:left w:type="dxa" w:w="100"/>
+              <w:bottom w:type="dxa" w:w="60"/>
+              <w:right w:type="dxa" w:w="100"/>
+            </w:tcMar>
+          </w:tcPr>
+          <w:p>
+            <w:r>
+              <w:rPr>
+                <w:color w:val="1E1E2E"/>
+                <w:sz w:val="18"/>
+                <w:szCs w:val="18"/>
+              </w:rPr>
+              <w:t xml:space="preserve">Filter by category name</w:t>
             </w:r>
           </w:p>
         </w:tc>
@@ -7401,7 +7367,7 @@
                 <w:sz w:val="18"/>
                 <w:szCs w:val="18"/>
               </w:rPr>
-              <w:t xml:space="preserve">`description`</w:t>
+              <w:t xml:space="preserve">`status`</w:t>
             </w:r>
           </w:p>
         </w:tc>
@@ -7464,351 +7430,7 @@
                 <w:sz w:val="18"/>
                 <w:szCs w:val="18"/>
               </w:rPr>
-              <w:t xml:space="preserve">What the service does</w:t>
-            </w:r>
-          </w:p>
-        </w:tc>
-      </w:tr>
-      <w:tr>
-        <w:tc>
-          <w:tcPr>
-            <w:shd w:color="F9FAFB" w:val="solid"/>
-            <w:tcMar>
-              <w:top w:type="dxa" w:w="60"/>
-              <w:left w:type="dxa" w:w="100"/>
-              <w:bottom w:type="dxa" w:w="60"/>
-              <w:right w:type="dxa" w:w="100"/>
-            </w:tcMar>
-          </w:tcPr>
-          <w:p>
-            <w:r>
-              <w:rPr>
-                <w:color w:val="1E1E2E"/>
-                <w:sz w:val="18"/>
-                <w:szCs w:val="18"/>
-              </w:rPr>
-              <w:t xml:space="preserve">`url`</w:t>
-            </w:r>
-          </w:p>
-        </w:tc>
-        <w:tc>
-          <w:tcPr>
-            <w:shd w:color="F9FAFB" w:val="solid"/>
-            <w:tcMar>
-              <w:top w:type="dxa" w:w="60"/>
-              <w:left w:type="dxa" w:w="100"/>
-              <w:bottom w:type="dxa" w:w="60"/>
-              <w:right w:type="dxa" w:w="100"/>
-            </w:tcMar>
-          </w:tcPr>
-          <w:p>
-            <w:r>
-              <w:rPr>
-                <w:color w:val="1E1E2E"/>
-                <w:sz w:val="18"/>
-                <w:szCs w:val="18"/>
-              </w:rPr>
-              <w:t xml:space="preserve">string</w:t>
-            </w:r>
-          </w:p>
-        </w:tc>
-        <w:tc>
-          <w:tcPr>
-            <w:shd w:color="F9FAFB" w:val="solid"/>
-            <w:tcMar>
-              <w:top w:type="dxa" w:w="60"/>
-              <w:left w:type="dxa" w:w="100"/>
-              <w:bottom w:type="dxa" w:w="60"/>
-              <w:right w:type="dxa" w:w="100"/>
-            </w:tcMar>
-          </w:tcPr>
-          <w:p>
-            <w:r>
-              <w:rPr>
-                <w:color w:val="1E1E2E"/>
-                <w:sz w:val="18"/>
-                <w:szCs w:val="18"/>
-              </w:rPr>
-              <w:t xml:space="preserve">No</w:t>
-            </w:r>
-          </w:p>
-        </w:tc>
-        <w:tc>
-          <w:tcPr>
-            <w:shd w:color="F9FAFB" w:val="solid"/>
-            <w:tcMar>
-              <w:top w:type="dxa" w:w="60"/>
-              <w:left w:type="dxa" w:w="100"/>
-              <w:bottom w:type="dxa" w:w="60"/>
-              <w:right w:type="dxa" w:w="100"/>
-            </w:tcMar>
-          </w:tcPr>
-          <w:p>
-            <w:r>
-              <w:rPr>
-                <w:color w:val="1E1E2E"/>
-                <w:sz w:val="18"/>
-                <w:szCs w:val="18"/>
-              </w:rPr>
-              <w:t xml:space="preserve">Service URL</w:t>
-            </w:r>
-          </w:p>
-        </w:tc>
-      </w:tr>
-      <w:tr>
-        <w:tc>
-          <w:tcPr>
-            <w:shd w:color="FFFFFF" w:val="solid"/>
-            <w:tcMar>
-              <w:top w:type="dxa" w:w="60"/>
-              <w:left w:type="dxa" w:w="100"/>
-              <w:bottom w:type="dxa" w:w="60"/>
-              <w:right w:type="dxa" w:w="100"/>
-            </w:tcMar>
-          </w:tcPr>
-          <w:p>
-            <w:r>
-              <w:rPr>
-                <w:color w:val="1E1E2E"/>
-                <w:sz w:val="18"/>
-                <w:szCs w:val="18"/>
-              </w:rPr>
-              <w:t xml:space="preserve">`status`</w:t>
-            </w:r>
-          </w:p>
-        </w:tc>
-        <w:tc>
-          <w:tcPr>
-            <w:shd w:color="FFFFFF" w:val="solid"/>
-            <w:tcMar>
-              <w:top w:type="dxa" w:w="60"/>
-              <w:left w:type="dxa" w:w="100"/>
-              <w:bottom w:type="dxa" w:w="60"/>
-              <w:right w:type="dxa" w:w="100"/>
-            </w:tcMar>
-          </w:tcPr>
-          <w:p>
-            <w:r>
-              <w:rPr>
-                <w:color w:val="1E1E2E"/>
-                <w:sz w:val="18"/>
-                <w:szCs w:val="18"/>
-              </w:rPr>
-              <w:t xml:space="preserve">string</w:t>
-            </w:r>
-          </w:p>
-        </w:tc>
-        <w:tc>
-          <w:tcPr>
-            <w:shd w:color="FFFFFF" w:val="solid"/>
-            <w:tcMar>
-              <w:top w:type="dxa" w:w="60"/>
-              <w:left w:type="dxa" w:w="100"/>
-              <w:bottom w:type="dxa" w:w="60"/>
-              <w:right w:type="dxa" w:w="100"/>
-            </w:tcMar>
-          </w:tcPr>
-          <w:p>
-            <w:r>
-              <w:rPr>
-                <w:color w:val="1E1E2E"/>
-                <w:sz w:val="18"/>
-                <w:szCs w:val="18"/>
-              </w:rPr>
-              <w:t xml:space="preserve">No</w:t>
-            </w:r>
-          </w:p>
-        </w:tc>
-        <w:tc>
-          <w:tcPr>
-            <w:shd w:color="FFFFFF" w:val="solid"/>
-            <w:tcMar>
-              <w:top w:type="dxa" w:w="60"/>
-              <w:left w:type="dxa" w:w="100"/>
-              <w:bottom w:type="dxa" w:w="60"/>
-              <w:right w:type="dxa" w:w="100"/>
-            </w:tcMar>
-          </w:tcPr>
-          <w:p>
-            <w:r>
-              <w:rPr>
-                <w:color w:val="1E1E2E"/>
-                <w:sz w:val="18"/>
-                <w:szCs w:val="18"/>
-              </w:rPr>
-              <w:t xml:space="preserve">active | evaluating | cancelled</w:t>
-            </w:r>
-          </w:p>
-        </w:tc>
-      </w:tr>
-      <w:tr>
-        <w:tc>
-          <w:tcPr>
-            <w:shd w:color="F9FAFB" w:val="solid"/>
-            <w:tcMar>
-              <w:top w:type="dxa" w:w="60"/>
-              <w:left w:type="dxa" w:w="100"/>
-              <w:bottom w:type="dxa" w:w="60"/>
-              <w:right w:type="dxa" w:w="100"/>
-            </w:tcMar>
-          </w:tcPr>
-          <w:p>
-            <w:r>
-              <w:rPr>
-                <w:color w:val="1E1E2E"/>
-                <w:sz w:val="18"/>
-                <w:szCs w:val="18"/>
-              </w:rPr>
-              <w:t xml:space="preserve">`cost`</w:t>
-            </w:r>
-          </w:p>
-        </w:tc>
-        <w:tc>
-          <w:tcPr>
-            <w:shd w:color="F9FAFB" w:val="solid"/>
-            <w:tcMar>
-              <w:top w:type="dxa" w:w="60"/>
-              <w:left w:type="dxa" w:w="100"/>
-              <w:bottom w:type="dxa" w:w="60"/>
-              <w:right w:type="dxa" w:w="100"/>
-            </w:tcMar>
-          </w:tcPr>
-          <w:p>
-            <w:r>
-              <w:rPr>
-                <w:color w:val="1E1E2E"/>
-                <w:sz w:val="18"/>
-                <w:szCs w:val="18"/>
-              </w:rPr>
-              <w:t xml:space="preserve">string</w:t>
-            </w:r>
-          </w:p>
-        </w:tc>
-        <w:tc>
-          <w:tcPr>
-            <w:shd w:color="F9FAFB" w:val="solid"/>
-            <w:tcMar>
-              <w:top w:type="dxa" w:w="60"/>
-              <w:left w:type="dxa" w:w="100"/>
-              <w:bottom w:type="dxa" w:w="60"/>
-              <w:right w:type="dxa" w:w="100"/>
-            </w:tcMar>
-          </w:tcPr>
-          <w:p>
-            <w:r>
-              <w:rPr>
-                <w:color w:val="1E1E2E"/>
-                <w:sz w:val="18"/>
-                <w:szCs w:val="18"/>
-              </w:rPr>
-              <w:t xml:space="preserve">No</w:t>
-            </w:r>
-          </w:p>
-        </w:tc>
-        <w:tc>
-          <w:tcPr>
-            <w:shd w:color="F9FAFB" w:val="solid"/>
-            <w:tcMar>
-              <w:top w:type="dxa" w:w="60"/>
-              <w:left w:type="dxa" w:w="100"/>
-              <w:bottom w:type="dxa" w:w="60"/>
-              <w:right w:type="dxa" w:w="100"/>
-            </w:tcMar>
-          </w:tcPr>
-          <w:p>
-            <w:r>
-              <w:rPr>
-                <w:color w:val="1E1E2E"/>
-                <w:sz w:val="18"/>
-                <w:szCs w:val="18"/>
-              </w:rPr>
-              <w:t xml:space="preserve">Monthly cost or pricing</w:t>
-            </w:r>
-          </w:p>
-        </w:tc>
-      </w:tr>
-      <w:tr>
-        <w:tc>
-          <w:tcPr>
-            <w:shd w:color="FFFFFF" w:val="solid"/>
-            <w:tcMar>
-              <w:top w:type="dxa" w:w="60"/>
-              <w:left w:type="dxa" w:w="100"/>
-              <w:bottom w:type="dxa" w:w="60"/>
-              <w:right w:type="dxa" w:w="100"/>
-            </w:tcMar>
-          </w:tcPr>
-          <w:p>
-            <w:r>
-              <w:rPr>
-                <w:color w:val="1E1E2E"/>
-                <w:sz w:val="18"/>
-                <w:szCs w:val="18"/>
-              </w:rPr>
-              <w:t xml:space="preserve">`category`</w:t>
-            </w:r>
-          </w:p>
-        </w:tc>
-        <w:tc>
-          <w:tcPr>
-            <w:shd w:color="FFFFFF" w:val="solid"/>
-            <w:tcMar>
-              <w:top w:type="dxa" w:w="60"/>
-              <w:left w:type="dxa" w:w="100"/>
-              <w:bottom w:type="dxa" w:w="60"/>
-              <w:right w:type="dxa" w:w="100"/>
-            </w:tcMar>
-          </w:tcPr>
-          <w:p>
-            <w:r>
-              <w:rPr>
-                <w:color w:val="1E1E2E"/>
-                <w:sz w:val="18"/>
-                <w:szCs w:val="18"/>
-              </w:rPr>
-              <w:t xml:space="preserve">string</w:t>
-            </w:r>
-          </w:p>
-        </w:tc>
-        <w:tc>
-          <w:tcPr>
-            <w:shd w:color="FFFFFF" w:val="solid"/>
-            <w:tcMar>
-              <w:top w:type="dxa" w:w="60"/>
-              <w:left w:type="dxa" w:w="100"/>
-              <w:bottom w:type="dxa" w:w="60"/>
-              <w:right w:type="dxa" w:w="100"/>
-            </w:tcMar>
-          </w:tcPr>
-          <w:p>
-            <w:r>
-              <w:rPr>
-                <w:color w:val="1E1E2E"/>
-                <w:sz w:val="18"/>
-                <w:szCs w:val="18"/>
-              </w:rPr>
-              <w:t xml:space="preserve">No</w:t>
-            </w:r>
-          </w:p>
-        </w:tc>
-        <w:tc>
-          <w:tcPr>
-            <w:shd w:color="FFFFFF" w:val="solid"/>
-            <w:tcMar>
-              <w:top w:type="dxa" w:w="60"/>
-              <w:left w:type="dxa" w:w="100"/>
-              <w:bottom w:type="dxa" w:w="60"/>
-              <w:right w:type="dxa" w:w="100"/>
-            </w:tcMar>
-          </w:tcPr>
-          <w:p>
-            <w:r>
-              <w:rPr>
-                <w:color w:val="1E1E2E"/>
-                <w:sz w:val="18"/>
-                <w:szCs w:val="18"/>
-              </w:rPr>
-              <w:t xml:space="preserve">Grouping label</w:t>
+              <w:t xml:space="preserve">Filter by status: idea | exploring | in_progress | done | shelved</w:t>
             </w:r>
           </w:p>
         </w:tc>
@@ -7816,25 +7438,53 @@
     </w:tbl>
     <w:p>
       <w:pPr>
-        <w:pBdr>
-          <w:bottom w:val="single" w:color="E5E7EB" w:sz="1"/>
-        </w:pBdr>
-        <w:spacing w:after="160" w:before="160"/>
-      </w:pPr>
-    </w:p>
-    <w:p>
-      <w:pPr>
-        <w:pStyle w:val="Heading1"/>
-        <w:spacing w:after="160" w:before="400"/>
+        <w:spacing w:after="80" w:before="240"/>
+      </w:pPr>
+      <w:r>
         <w:rPr>
           <w:b/>
           <w:bCs/>
           <w:color w:val="1E1E2E"/>
-        </w:rPr>
-      </w:pPr>
-      <w:r>
-        <w:t xml:space="preserve">9. Portfolio</w:t>
-      </w:r>
+          <w:sz w:val="22"/>
+          <w:szCs w:val="22"/>
+        </w:rPr>
+        <w:t xml:space="preserve">Example response</w:t>
+      </w:r>
+    </w:p>
+    <w:p>
+      <w:pPr>
+        <w:shd w:color="2A2A3E" w:val="solid"/>
+        <w:spacing w:after="120" w:before="60"/>
+        <w:ind w:left="288" w:right="288"/>
+      </w:pPr>
+      <w:r>
+        <w:rPr>
+          <w:rFonts w:ascii="Courier New" w:cs="Courier New" w:eastAsia="Courier New" w:hAnsi="Courier New"/>
+          <w:color w:val="A5F3FC"/>
+          <w:sz w:val="18"/>
+          <w:szCs w:val="18"/>
+        </w:rPr>
+        <w:t xml:space="preserve">[
+  {
+    "id": 1,
+    "title": "AI-powered lead scoring tool",
+    "description": "Build a Claude agent that scores inbound leads...",
+    "category": "product",
+    "status": "exploring",
+    "priority": "high",
+    "color": "yellow",
+    "tags": "ai, leads, automation",
+    "pinned": 1,
+    "createdAt": "2025-07-01T10:00:00Z",
+    "updatedAt": "2025-07-01T12:30:00Z"
+  }
+]</w:t>
+      </w:r>
+    </w:p>
+    <w:p>
+      <w:pPr>
+        <w:spacing w:after="80" w:before="80"/>
+      </w:pPr>
     </w:p>
     <w:p>
       <w:pPr>
@@ -7845,32 +7495,7 @@
         </w:rPr>
       </w:pPr>
       <w:r>
-        <w:t xml:space="preserve">List / Create / Update / Delete</w:t>
-      </w:r>
-    </w:p>
-    <w:p>
-      <w:pPr>
-        <w:spacing w:after="80" w:before="160"/>
-      </w:pPr>
-      <w:r>
-        <w:rPr>
-          <w:b/>
-          <w:bCs/>
-          <w:color w:val="FFFFFF"/>
-          <w:sz w:val="18"/>
-          <w:szCs w:val="18"/>
-          <w:shd w:color="059669" w:val="solid"/>
-        </w:rPr>
-        <w:t xml:space="preserve"> GET </w:t>
-      </w:r>
-      <w:r>
-        <w:rPr>
-          <w:rFonts w:ascii="Courier New" w:cs="Courier New" w:eastAsia="Courier New" w:hAnsi="Courier New"/>
-          <w:color w:val="1E1E2E"/>
-          <w:sz w:val="20"/>
-          <w:szCs w:val="20"/>
-        </w:rPr>
-        <w:t xml:space="preserve">  /api/portfolio</w:t>
+        <w:t xml:space="preserve">Create idea</w:t>
       </w:r>
     </w:p>
     <w:p>
@@ -7895,57 +7520,7 @@
           <w:sz w:val="20"/>
           <w:szCs w:val="20"/>
         </w:rPr>
-        <w:t xml:space="preserve">  /api/portfolio</w:t>
-      </w:r>
-    </w:p>
-    <w:p>
-      <w:pPr>
-        <w:spacing w:after="80" w:before="160"/>
-      </w:pPr>
-      <w:r>
-        <w:rPr>
-          <w:b/>
-          <w:bCs/>
-          <w:color w:val="FFFFFF"/>
-          <w:sz w:val="18"/>
-          <w:szCs w:val="18"/>
-          <w:shd w:color="D97706" w:val="solid"/>
-        </w:rPr>
-        <w:t xml:space="preserve"> PATCH </w:t>
-      </w:r>
-      <w:r>
-        <w:rPr>
-          <w:rFonts w:ascii="Courier New" w:cs="Courier New" w:eastAsia="Courier New" w:hAnsi="Courier New"/>
-          <w:color w:val="1E1E2E"/>
-          <w:sz w:val="20"/>
-          <w:szCs w:val="20"/>
-        </w:rPr>
-        <w:t xml:space="preserve">  /api/portfolio/:id</w:t>
-      </w:r>
-    </w:p>
-    <w:p>
-      <w:pPr>
-        <w:spacing w:after="80" w:before="160"/>
-      </w:pPr>
-      <w:r>
-        <w:rPr>
-          <w:b/>
-          <w:bCs/>
-          <w:color w:val="FFFFFF"/>
-          <w:sz w:val="18"/>
-          <w:szCs w:val="18"/>
-          <w:shd w:color="DC2626" w:val="solid"/>
-        </w:rPr>
-        <w:t xml:space="preserve"> DELETE </w:t>
-      </w:r>
-      <w:r>
-        <w:rPr>
-          <w:rFonts w:ascii="Courier New" w:cs="Courier New" w:eastAsia="Courier New" w:hAnsi="Courier New"/>
-          <w:color w:val="1E1E2E"/>
-          <w:sz w:val="20"/>
-          <w:szCs w:val="20"/>
-        </w:rPr>
-        <w:t xml:space="preserve">  /api/portfolio/:id</w:t>
+        <w:t xml:space="preserve">  /api/ideas</w:t>
       </w:r>
     </w:p>
     <w:tbl>
@@ -8123,28 +7698,28 @@
                 <w:sz w:val="18"/>
                 <w:szCs w:val="18"/>
               </w:rPr>
-              <w:t xml:space="preserve">Yes</w:t>
-            </w:r>
-          </w:p>
-        </w:tc>
-        <w:tc>
-          <w:tcPr>
-            <w:shd w:color="F9FAFB" w:val="solid"/>
-            <w:tcMar>
-              <w:top w:type="dxa" w:w="60"/>
-              <w:left w:type="dxa" w:w="100"/>
-              <w:bottom w:type="dxa" w:w="60"/>
-              <w:right w:type="dxa" w:w="100"/>
-            </w:tcMar>
-          </w:tcPr>
-          <w:p>
-            <w:r>
-              <w:rPr>
-                <w:color w:val="1E1E2E"/>
-                <w:sz w:val="18"/>
-                <w:szCs w:val="18"/>
-              </w:rPr>
-              <w:t xml:space="preserve">Project title</w:t>
+              <w:t xml:space="preserve">No</w:t>
+            </w:r>
+          </w:p>
+        </w:tc>
+        <w:tc>
+          <w:tcPr>
+            <w:shd w:color="F9FAFB" w:val="solid"/>
+            <w:tcMar>
+              <w:top w:type="dxa" w:w="60"/>
+              <w:left w:type="dxa" w:w="100"/>
+              <w:bottom w:type="dxa" w:w="60"/>
+              <w:right w:type="dxa" w:w="100"/>
+            </w:tcMar>
+          </w:tcPr>
+          <w:p>
+            <w:r>
+              <w:rPr>
+                <w:color w:val="1E1E2E"/>
+                <w:sz w:val="18"/>
+                <w:szCs w:val="18"/>
+              </w:rPr>
+              <w:t xml:space="preserve">Idea title — defaults to empty string</w:t>
             </w:r>
           </w:p>
         </w:tc>
@@ -8230,7 +7805,7 @@
                 <w:sz w:val="18"/>
                 <w:szCs w:val="18"/>
               </w:rPr>
-              <w:t xml:space="preserve">Project description</w:t>
+              <w:t xml:space="preserve">Full description of the idea</w:t>
             </w:r>
           </w:p>
         </w:tc>
@@ -8253,7 +7828,7 @@
                 <w:sz w:val="18"/>
                 <w:szCs w:val="18"/>
               </w:rPr>
-              <w:t xml:space="preserve">`url`</w:t>
+              <w:t xml:space="preserve">`category`</w:t>
             </w:r>
           </w:p>
         </w:tc>
@@ -8316,7 +7891,7 @@
                 <w:sz w:val="18"/>
                 <w:szCs w:val="18"/>
               </w:rPr>
-              <w:t xml:space="preserve">Live URL</w:t>
+              <w:t xml:space="preserve">Free-text category label — defaults to 'general'</w:t>
             </w:r>
           </w:p>
         </w:tc>
@@ -8339,7 +7914,7 @@
                 <w:sz w:val="18"/>
                 <w:szCs w:val="18"/>
               </w:rPr>
-              <w:t xml:space="preserve">`repoUrl`</w:t>
+              <w:t xml:space="preserve">`status`</w:t>
             </w:r>
           </w:p>
         </w:tc>
@@ -8402,7 +7977,7 @@
                 <w:sz w:val="18"/>
                 <w:szCs w:val="18"/>
               </w:rPr>
-              <w:t xml:space="preserve">GitHub repo URL</w:t>
+              <w:t xml:space="preserve">idea (default) | exploring | in_progress | done | shelved</w:t>
             </w:r>
           </w:p>
         </w:tc>
@@ -8425,7 +8000,7 @@
                 <w:sz w:val="18"/>
                 <w:szCs w:val="18"/>
               </w:rPr>
-              <w:t xml:space="preserve">`skills`</w:t>
+              <w:t xml:space="preserve">`priority`</w:t>
             </w:r>
           </w:p>
         </w:tc>
@@ -8488,12 +8063,514 @@
                 <w:sz w:val="18"/>
                 <w:szCs w:val="18"/>
               </w:rPr>
-              <w:t xml:space="preserve">Comma-separated tech stack</w:t>
+              <w:t xml:space="preserve">low | medium (default) | high</w:t>
+            </w:r>
+          </w:p>
+        </w:tc>
+      </w:tr>
+      <w:tr>
+        <w:tc>
+          <w:tcPr>
+            <w:shd w:color="FFFFFF" w:val="solid"/>
+            <w:tcMar>
+              <w:top w:type="dxa" w:w="60"/>
+              <w:left w:type="dxa" w:w="100"/>
+              <w:bottom w:type="dxa" w:w="60"/>
+              <w:right w:type="dxa" w:w="100"/>
+            </w:tcMar>
+          </w:tcPr>
+          <w:p>
+            <w:r>
+              <w:rPr>
+                <w:color w:val="1E1E2E"/>
+                <w:sz w:val="18"/>
+                <w:szCs w:val="18"/>
+              </w:rPr>
+              <w:t xml:space="preserve">`color`</w:t>
+            </w:r>
+          </w:p>
+        </w:tc>
+        <w:tc>
+          <w:tcPr>
+            <w:shd w:color="FFFFFF" w:val="solid"/>
+            <w:tcMar>
+              <w:top w:type="dxa" w:w="60"/>
+              <w:left w:type="dxa" w:w="100"/>
+              <w:bottom w:type="dxa" w:w="60"/>
+              <w:right w:type="dxa" w:w="100"/>
+            </w:tcMar>
+          </w:tcPr>
+          <w:p>
+            <w:r>
+              <w:rPr>
+                <w:color w:val="1E1E2E"/>
+                <w:sz w:val="18"/>
+                <w:szCs w:val="18"/>
+              </w:rPr>
+              <w:t xml:space="preserve">string</w:t>
+            </w:r>
+          </w:p>
+        </w:tc>
+        <w:tc>
+          <w:tcPr>
+            <w:shd w:color="FFFFFF" w:val="solid"/>
+            <w:tcMar>
+              <w:top w:type="dxa" w:w="60"/>
+              <w:left w:type="dxa" w:w="100"/>
+              <w:bottom w:type="dxa" w:w="60"/>
+              <w:right w:type="dxa" w:w="100"/>
+            </w:tcMar>
+          </w:tcPr>
+          <w:p>
+            <w:r>
+              <w:rPr>
+                <w:color w:val="1E1E2E"/>
+                <w:sz w:val="18"/>
+                <w:szCs w:val="18"/>
+              </w:rPr>
+              <w:t xml:space="preserve">No</w:t>
+            </w:r>
+          </w:p>
+        </w:tc>
+        <w:tc>
+          <w:tcPr>
+            <w:shd w:color="FFFFFF" w:val="solid"/>
+            <w:tcMar>
+              <w:top w:type="dxa" w:w="60"/>
+              <w:left w:type="dxa" w:w="100"/>
+              <w:bottom w:type="dxa" w:w="60"/>
+              <w:right w:type="dxa" w:w="100"/>
+            </w:tcMar>
+          </w:tcPr>
+          <w:p>
+            <w:r>
+              <w:rPr>
+                <w:color w:val="1E1E2E"/>
+                <w:sz w:val="18"/>
+                <w:szCs w:val="18"/>
+              </w:rPr>
+              <w:t xml:space="preserve">white (default) | yellow | blue | green | pink | purple | orange</w:t>
+            </w:r>
+          </w:p>
+        </w:tc>
+      </w:tr>
+      <w:tr>
+        <w:tc>
+          <w:tcPr>
+            <w:shd w:color="F9FAFB" w:val="solid"/>
+            <w:tcMar>
+              <w:top w:type="dxa" w:w="60"/>
+              <w:left w:type="dxa" w:w="100"/>
+              <w:bottom w:type="dxa" w:w="60"/>
+              <w:right w:type="dxa" w:w="100"/>
+            </w:tcMar>
+          </w:tcPr>
+          <w:p>
+            <w:r>
+              <w:rPr>
+                <w:color w:val="1E1E2E"/>
+                <w:sz w:val="18"/>
+                <w:szCs w:val="18"/>
+              </w:rPr>
+              <w:t xml:space="preserve">`tags`</w:t>
+            </w:r>
+          </w:p>
+        </w:tc>
+        <w:tc>
+          <w:tcPr>
+            <w:shd w:color="F9FAFB" w:val="solid"/>
+            <w:tcMar>
+              <w:top w:type="dxa" w:w="60"/>
+              <w:left w:type="dxa" w:w="100"/>
+              <w:bottom w:type="dxa" w:w="60"/>
+              <w:right w:type="dxa" w:w="100"/>
+            </w:tcMar>
+          </w:tcPr>
+          <w:p>
+            <w:r>
+              <w:rPr>
+                <w:color w:val="1E1E2E"/>
+                <w:sz w:val="18"/>
+                <w:szCs w:val="18"/>
+              </w:rPr>
+              <w:t xml:space="preserve">string</w:t>
+            </w:r>
+          </w:p>
+        </w:tc>
+        <w:tc>
+          <w:tcPr>
+            <w:shd w:color="F9FAFB" w:val="solid"/>
+            <w:tcMar>
+              <w:top w:type="dxa" w:w="60"/>
+              <w:left w:type="dxa" w:w="100"/>
+              <w:bottom w:type="dxa" w:w="60"/>
+              <w:right w:type="dxa" w:w="100"/>
+            </w:tcMar>
+          </w:tcPr>
+          <w:p>
+            <w:r>
+              <w:rPr>
+                <w:color w:val="1E1E2E"/>
+                <w:sz w:val="18"/>
+                <w:szCs w:val="18"/>
+              </w:rPr>
+              <w:t xml:space="preserve">No</w:t>
+            </w:r>
+          </w:p>
+        </w:tc>
+        <w:tc>
+          <w:tcPr>
+            <w:shd w:color="F9FAFB" w:val="solid"/>
+            <w:tcMar>
+              <w:top w:type="dxa" w:w="60"/>
+              <w:left w:type="dxa" w:w="100"/>
+              <w:bottom w:type="dxa" w:w="60"/>
+              <w:right w:type="dxa" w:w="100"/>
+            </w:tcMar>
+          </w:tcPr>
+          <w:p>
+            <w:r>
+              <w:rPr>
+                <w:color w:val="1E1E2E"/>
+                <w:sz w:val="18"/>
+                <w:szCs w:val="18"/>
+              </w:rPr>
+              <w:t xml:space="preserve">Comma-separated tags e.g. 'ai, product, saas'</w:t>
+            </w:r>
+          </w:p>
+        </w:tc>
+      </w:tr>
+      <w:tr>
+        <w:tc>
+          <w:tcPr>
+            <w:shd w:color="FFFFFF" w:val="solid"/>
+            <w:tcMar>
+              <w:top w:type="dxa" w:w="60"/>
+              <w:left w:type="dxa" w:w="100"/>
+              <w:bottom w:type="dxa" w:w="60"/>
+              <w:right w:type="dxa" w:w="100"/>
+            </w:tcMar>
+          </w:tcPr>
+          <w:p>
+            <w:r>
+              <w:rPr>
+                <w:color w:val="1E1E2E"/>
+                <w:sz w:val="18"/>
+                <w:szCs w:val="18"/>
+              </w:rPr>
+              <w:t xml:space="preserve">`pinned`</w:t>
+            </w:r>
+          </w:p>
+        </w:tc>
+        <w:tc>
+          <w:tcPr>
+            <w:shd w:color="FFFFFF" w:val="solid"/>
+            <w:tcMar>
+              <w:top w:type="dxa" w:w="60"/>
+              <w:left w:type="dxa" w:w="100"/>
+              <w:bottom w:type="dxa" w:w="60"/>
+              <w:right w:type="dxa" w:w="100"/>
+            </w:tcMar>
+          </w:tcPr>
+          <w:p>
+            <w:r>
+              <w:rPr>
+                <w:color w:val="1E1E2E"/>
+                <w:sz w:val="18"/>
+                <w:szCs w:val="18"/>
+              </w:rPr>
+              <w:t xml:space="preserve">integer</w:t>
+            </w:r>
+          </w:p>
+        </w:tc>
+        <w:tc>
+          <w:tcPr>
+            <w:shd w:color="FFFFFF" w:val="solid"/>
+            <w:tcMar>
+              <w:top w:type="dxa" w:w="60"/>
+              <w:left w:type="dxa" w:w="100"/>
+              <w:bottom w:type="dxa" w:w="60"/>
+              <w:right w:type="dxa" w:w="100"/>
+            </w:tcMar>
+          </w:tcPr>
+          <w:p>
+            <w:r>
+              <w:rPr>
+                <w:color w:val="1E1E2E"/>
+                <w:sz w:val="18"/>
+                <w:szCs w:val="18"/>
+              </w:rPr>
+              <w:t xml:space="preserve">No</w:t>
+            </w:r>
+          </w:p>
+        </w:tc>
+        <w:tc>
+          <w:tcPr>
+            <w:shd w:color="FFFFFF" w:val="solid"/>
+            <w:tcMar>
+              <w:top w:type="dxa" w:w="60"/>
+              <w:left w:type="dxa" w:w="100"/>
+              <w:bottom w:type="dxa" w:w="60"/>
+              <w:right w:type="dxa" w:w="100"/>
+            </w:tcMar>
+          </w:tcPr>
+          <w:p>
+            <w:r>
+              <w:rPr>
+                <w:color w:val="1E1E2E"/>
+                <w:sz w:val="18"/>
+                <w:szCs w:val="18"/>
+              </w:rPr>
+              <w:t xml:space="preserve">1 = pinned, 0 = unpinned (default)</w:t>
             </w:r>
           </w:p>
         </w:tc>
       </w:tr>
     </w:tbl>
+    <w:p>
+      <w:pPr>
+        <w:spacing w:after="80" w:before="240"/>
+      </w:pPr>
+      <w:r>
+        <w:rPr>
+          <w:b/>
+          <w:bCs/>
+          <w:color w:val="1E1E2E"/>
+          <w:sz w:val="22"/>
+          <w:szCs w:val="22"/>
+        </w:rPr>
+        <w:t xml:space="preserve">Example</w:t>
+      </w:r>
+    </w:p>
+    <w:p>
+      <w:pPr>
+        <w:shd w:color="2A2A3E" w:val="solid"/>
+        <w:spacing w:after="120" w:before="60"/>
+        <w:ind w:left="288" w:right="288"/>
+      </w:pPr>
+      <w:r>
+        <w:rPr>
+          <w:rFonts w:ascii="Courier New" w:cs="Courier New" w:eastAsia="Courier New" w:hAnsi="Courier New"/>
+          <w:color w:val="A5F3FC"/>
+          <w:sz w:val="18"/>
+          <w:szCs w:val="18"/>
+        </w:rPr>
+        <w:t xml:space="preserve">POST /api/ideas
+{
+  "title": "RAG pipeline for client onboarding docs",
+  "description": "Ingest client-provided docs into Pinecone...",
+  "category": "product",
+  "status": "exploring",
+  "priority": "high",
+  "color": "blue",
+  "tags": "rag, pinecone, onboarding"
+}</w:t>
+      </w:r>
+    </w:p>
+    <w:p>
+      <w:pPr>
+        <w:spacing w:after="80" w:before="80"/>
+      </w:pPr>
+    </w:p>
+    <w:p>
+      <w:pPr>
+        <w:pStyle w:val="Heading2"/>
+        <w:spacing w:after="120" w:before="320"/>
+        <w:rPr>
+          <w:color w:val="6366F1"/>
+        </w:rPr>
+      </w:pPr>
+      <w:r>
+        <w:t xml:space="preserve">Update idea</w:t>
+      </w:r>
+    </w:p>
+    <w:p>
+      <w:pPr>
+        <w:spacing w:after="80" w:before="160"/>
+      </w:pPr>
+      <w:r>
+        <w:rPr>
+          <w:b/>
+          <w:bCs/>
+          <w:color w:val="FFFFFF"/>
+          <w:sz w:val="18"/>
+          <w:szCs w:val="18"/>
+          <w:shd w:color="D97706" w:val="solid"/>
+        </w:rPr>
+        <w:t xml:space="preserve"> PATCH </w:t>
+      </w:r>
+      <w:r>
+        <w:rPr>
+          <w:rFonts w:ascii="Courier New" w:cs="Courier New" w:eastAsia="Courier New" w:hAnsi="Courier New"/>
+          <w:color w:val="1E1E2E"/>
+          <w:sz w:val="20"/>
+          <w:szCs w:val="20"/>
+        </w:rPr>
+        <w:t xml:space="preserve">  /api/ideas/:id</w:t>
+      </w:r>
+    </w:p>
+    <w:p>
+      <w:pPr>
+        <w:spacing w:after="80" w:before="40"/>
+      </w:pPr>
+      <w:r>
+        <w:rPr>
+          <w:color w:val="374151"/>
+          <w:sz w:val="20"/>
+          <w:szCs w:val="20"/>
+        </w:rPr>
+        <w:t xml:space="preserve">Partially updates an idea. Send only the fields you want to change. updatedAt is always refreshed.</w:t>
+      </w:r>
+    </w:p>
+    <w:p>
+      <w:pPr>
+        <w:spacing w:after="80" w:before="240"/>
+      </w:pPr>
+      <w:r>
+        <w:rPr>
+          <w:b/>
+          <w:bCs/>
+          <w:color w:val="1E1E2E"/>
+          <w:sz w:val="22"/>
+          <w:szCs w:val="22"/>
+        </w:rPr>
+        <w:t xml:space="preserve">Examples</w:t>
+      </w:r>
+    </w:p>
+    <w:p>
+      <w:pPr>
+        <w:shd w:color="2A2A3E" w:val="solid"/>
+        <w:spacing w:after="120" w:before="60"/>
+        <w:ind w:left="288" w:right="288"/>
+      </w:pPr>
+      <w:r>
+        <w:rPr>
+          <w:rFonts w:ascii="Courier New" w:cs="Courier New" w:eastAsia="Courier New" w:hAnsi="Courier New"/>
+          <w:color w:val="A5F3FC"/>
+          <w:sz w:val="18"/>
+          <w:szCs w:val="18"/>
+        </w:rPr>
+        <w:t xml:space="preserve">// Move to in_progress
+PATCH /api/ideas/3
+{ "status": "in_progress" }
+// Pin an idea
+PATCH /api/ideas/3
+{ "pinned": 1 }
+// Update tags
+PATCH /api/ideas/3
+{ "tags": "ai, automation, v2" }</w:t>
+      </w:r>
+    </w:p>
+    <w:p>
+      <w:pPr>
+        <w:spacing w:after="80" w:before="80"/>
+      </w:pPr>
+    </w:p>
+    <w:p>
+      <w:pPr>
+        <w:pStyle w:val="Heading2"/>
+        <w:spacing w:after="120" w:before="320"/>
+        <w:rPr>
+          <w:color w:val="6366F1"/>
+        </w:rPr>
+      </w:pPr>
+      <w:r>
+        <w:t xml:space="preserve">Delete idea</w:t>
+      </w:r>
+    </w:p>
+    <w:p>
+      <w:pPr>
+        <w:spacing w:after="80" w:before="160"/>
+      </w:pPr>
+      <w:r>
+        <w:rPr>
+          <w:b/>
+          <w:bCs/>
+          <w:color w:val="FFFFFF"/>
+          <w:sz w:val="18"/>
+          <w:szCs w:val="18"/>
+          <w:shd w:color="DC2626" w:val="solid"/>
+        </w:rPr>
+        <w:t xml:space="preserve"> DELETE </w:t>
+      </w:r>
+      <w:r>
+        <w:rPr>
+          <w:rFonts w:ascii="Courier New" w:cs="Courier New" w:eastAsia="Courier New" w:hAnsi="Courier New"/>
+          <w:color w:val="1E1E2E"/>
+          <w:sz w:val="20"/>
+          <w:szCs w:val="20"/>
+        </w:rPr>
+        <w:t xml:space="preserve">  /api/ideas/:id</w:t>
+      </w:r>
+    </w:p>
+    <w:p>
+      <w:pPr>
+        <w:spacing w:after="80" w:before="40"/>
+      </w:pPr>
+      <w:r>
+        <w:rPr>
+          <w:color w:val="374151"/>
+          <w:sz w:val="20"/>
+          <w:szCs w:val="20"/>
+        </w:rPr>
+        <w:t xml:space="preserve">Permanently deletes a single idea.</w:t>
+      </w:r>
+    </w:p>
+    <w:p>
+      <w:pPr>
+        <w:spacing w:after="80" w:before="80"/>
+      </w:pPr>
+    </w:p>
+    <w:p>
+      <w:pPr>
+        <w:pStyle w:val="Heading2"/>
+        <w:spacing w:after="120" w:before="320"/>
+        <w:rPr>
+          <w:color w:val="6366F1"/>
+        </w:rPr>
+      </w:pPr>
+      <w:r>
+        <w:t xml:space="preserve">Delete all ideas</w:t>
+      </w:r>
+    </w:p>
+    <w:p>
+      <w:pPr>
+        <w:spacing w:after="80" w:before="160"/>
+      </w:pPr>
+      <w:r>
+        <w:rPr>
+          <w:b/>
+          <w:bCs/>
+          <w:color w:val="FFFFFF"/>
+          <w:sz w:val="18"/>
+          <w:szCs w:val="18"/>
+          <w:shd w:color="DC2626" w:val="solid"/>
+        </w:rPr>
+        <w:t xml:space="preserve"> DELETE </w:t>
+      </w:r>
+      <w:r>
+        <w:rPr>
+          <w:rFonts w:ascii="Courier New" w:cs="Courier New" w:eastAsia="Courier New" w:hAnsi="Courier New"/>
+          <w:color w:val="1E1E2E"/>
+          <w:sz w:val="20"/>
+          <w:szCs w:val="20"/>
+        </w:rPr>
+        <w:t xml:space="preserve">  /api/ideas</w:t>
+      </w:r>
+    </w:p>
+    <w:p>
+      <w:pPr>
+        <w:spacing w:after="80" w:before="40"/>
+      </w:pPr>
+      <w:r>
+        <w:rPr>
+          <w:color w:val="374151"/>
+          <w:sz w:val="20"/>
+          <w:szCs w:val="20"/>
+        </w:rPr>
+        <w:t xml:space="preserve">Permanently deletes every idea. No confirmation required — use with care.</w:t>
+      </w:r>
+    </w:p>
     <w:p>
       <w:pPr>
         <w:pBdr>
@@ -8504,6 +8581,1452 @@
     </w:p>
     <w:p>
       <w:pPr>
+        <w:pStyle w:val="Heading1"/>
+        <w:spacing w:after="160" w:before="400"/>
+        <w:rPr>
+          <w:b/>
+          <w:bCs/>
+          <w:color w:val="1E1E2E"/>
+        </w:rPr>
+      </w:pPr>
+      <w:r>
+        <w:t xml:space="preserve">9. Services</w:t>
+      </w:r>
+    </w:p>
+    <w:p>
+      <w:pPr>
+        <w:pStyle w:val="Heading2"/>
+        <w:spacing w:after="120" w:before="320"/>
+        <w:rPr>
+          <w:color w:val="6366F1"/>
+        </w:rPr>
+      </w:pPr>
+      <w:r>
+        <w:t xml:space="preserve">List / Create / Update / Delete</w:t>
+      </w:r>
+    </w:p>
+    <w:p>
+      <w:pPr>
+        <w:spacing w:after="80" w:before="160"/>
+      </w:pPr>
+      <w:r>
+        <w:rPr>
+          <w:b/>
+          <w:bCs/>
+          <w:color w:val="FFFFFF"/>
+          <w:sz w:val="18"/>
+          <w:szCs w:val="18"/>
+          <w:shd w:color="059669" w:val="solid"/>
+        </w:rPr>
+        <w:t xml:space="preserve"> GET </w:t>
+      </w:r>
+      <w:r>
+        <w:rPr>
+          <w:rFonts w:ascii="Courier New" w:cs="Courier New" w:eastAsia="Courier New" w:hAnsi="Courier New"/>
+          <w:color w:val="1E1E2E"/>
+          <w:sz w:val="20"/>
+          <w:szCs w:val="20"/>
+        </w:rPr>
+        <w:t xml:space="preserve">  /api/services</w:t>
+      </w:r>
+    </w:p>
+    <w:p>
+      <w:pPr>
+        <w:spacing w:after="80" w:before="160"/>
+      </w:pPr>
+      <w:r>
+        <w:rPr>
+          <w:b/>
+          <w:bCs/>
+          <w:color w:val="FFFFFF"/>
+          <w:sz w:val="18"/>
+          <w:szCs w:val="18"/>
+          <w:shd w:color="2563EB" w:val="solid"/>
+        </w:rPr>
+        <w:t xml:space="preserve"> POST </w:t>
+      </w:r>
+      <w:r>
+        <w:rPr>
+          <w:rFonts w:ascii="Courier New" w:cs="Courier New" w:eastAsia="Courier New" w:hAnsi="Courier New"/>
+          <w:color w:val="1E1E2E"/>
+          <w:sz w:val="20"/>
+          <w:szCs w:val="20"/>
+        </w:rPr>
+        <w:t xml:space="preserve">  /api/services</w:t>
+      </w:r>
+    </w:p>
+    <w:p>
+      <w:pPr>
+        <w:spacing w:after="80" w:before="160"/>
+      </w:pPr>
+      <w:r>
+        <w:rPr>
+          <w:b/>
+          <w:bCs/>
+          <w:color w:val="FFFFFF"/>
+          <w:sz w:val="18"/>
+          <w:szCs w:val="18"/>
+          <w:shd w:color="D97706" w:val="solid"/>
+        </w:rPr>
+        <w:t xml:space="preserve"> PATCH </w:t>
+      </w:r>
+      <w:r>
+        <w:rPr>
+          <w:rFonts w:ascii="Courier New" w:cs="Courier New" w:eastAsia="Courier New" w:hAnsi="Courier New"/>
+          <w:color w:val="1E1E2E"/>
+          <w:sz w:val="20"/>
+          <w:szCs w:val="20"/>
+        </w:rPr>
+        <w:t xml:space="preserve">  /api/services/:id</w:t>
+      </w:r>
+    </w:p>
+    <w:p>
+      <w:pPr>
+        <w:spacing w:after="80" w:before="160"/>
+      </w:pPr>
+      <w:r>
+        <w:rPr>
+          <w:b/>
+          <w:bCs/>
+          <w:color w:val="FFFFFF"/>
+          <w:sz w:val="18"/>
+          <w:szCs w:val="18"/>
+          <w:shd w:color="DC2626" w:val="solid"/>
+        </w:rPr>
+        <w:t xml:space="preserve"> DELETE </w:t>
+      </w:r>
+      <w:r>
+        <w:rPr>
+          <w:rFonts w:ascii="Courier New" w:cs="Courier New" w:eastAsia="Courier New" w:hAnsi="Courier New"/>
+          <w:color w:val="1E1E2E"/>
+          <w:sz w:val="20"/>
+          <w:szCs w:val="20"/>
+        </w:rPr>
+        <w:t xml:space="preserve">  /api/services/:id</w:t>
+      </w:r>
+    </w:p>
+    <w:tbl>
+      <w:tblPr>
+        <w:tblW w:type="pct" w:w="100%"/>
+        <w:tblBorders>
+          <w:top w:val="single" w:color="auto" w:sz="4"/>
+          <w:left w:val="single" w:color="auto" w:sz="4"/>
+          <w:bottom w:val="single" w:color="auto" w:sz="4"/>
+          <w:right w:val="single" w:color="auto" w:sz="4"/>
+          <w:insideH w:val="single" w:color="auto" w:sz="4"/>
+          <w:insideV w:val="single" w:color="auto" w:sz="4"/>
+        </w:tblBorders>
+      </w:tblPr>
+      <w:tblGrid>
+        <w:gridCol w:w="100"/>
+        <w:gridCol w:w="100"/>
+        <w:gridCol w:w="100"/>
+        <w:gridCol w:w="100"/>
+      </w:tblGrid>
+      <w:tr>
+        <w:trPr>
+          <w:tblHeader/>
+        </w:trPr>
+        <w:tc>
+          <w:tcPr>
+            <w:shd w:color="6366F1" w:val="solid"/>
+            <w:tcMar>
+              <w:top w:type="dxa" w:w="60"/>
+              <w:left w:type="dxa" w:w="100"/>
+              <w:bottom w:type="dxa" w:w="60"/>
+              <w:right w:type="dxa" w:w="100"/>
+            </w:tcMar>
+          </w:tcPr>
+          <w:p>
+            <w:r>
+              <w:rPr>
+                <w:b/>
+                <w:bCs/>
+                <w:color w:val="FFFFFF"/>
+                <w:sz w:val="18"/>
+                <w:szCs w:val="18"/>
+              </w:rPr>
+              <w:t xml:space="preserve">Field</w:t>
+            </w:r>
+          </w:p>
+        </w:tc>
+        <w:tc>
+          <w:tcPr>
+            <w:shd w:color="6366F1" w:val="solid"/>
+            <w:tcMar>
+              <w:top w:type="dxa" w:w="60"/>
+              <w:left w:type="dxa" w:w="100"/>
+              <w:bottom w:type="dxa" w:w="60"/>
+              <w:right w:type="dxa" w:w="100"/>
+            </w:tcMar>
+          </w:tcPr>
+          <w:p>
+            <w:r>
+              <w:rPr>
+                <w:b/>
+                <w:bCs/>
+                <w:color w:val="FFFFFF"/>
+                <w:sz w:val="18"/>
+                <w:szCs w:val="18"/>
+              </w:rPr>
+              <w:t xml:space="preserve">Type</w:t>
+            </w:r>
+          </w:p>
+        </w:tc>
+        <w:tc>
+          <w:tcPr>
+            <w:shd w:color="6366F1" w:val="solid"/>
+            <w:tcMar>
+              <w:top w:type="dxa" w:w="60"/>
+              <w:left w:type="dxa" w:w="100"/>
+              <w:bottom w:type="dxa" w:w="60"/>
+              <w:right w:type="dxa" w:w="100"/>
+            </w:tcMar>
+          </w:tcPr>
+          <w:p>
+            <w:r>
+              <w:rPr>
+                <w:b/>
+                <w:bCs/>
+                <w:color w:val="FFFFFF"/>
+                <w:sz w:val="18"/>
+                <w:szCs w:val="18"/>
+              </w:rPr>
+              <w:t xml:space="preserve">Required</w:t>
+            </w:r>
+          </w:p>
+        </w:tc>
+        <w:tc>
+          <w:tcPr>
+            <w:shd w:color="6366F1" w:val="solid"/>
+            <w:tcMar>
+              <w:top w:type="dxa" w:w="60"/>
+              <w:left w:type="dxa" w:w="100"/>
+              <w:bottom w:type="dxa" w:w="60"/>
+              <w:right w:type="dxa" w:w="100"/>
+            </w:tcMar>
+          </w:tcPr>
+          <w:p>
+            <w:r>
+              <w:rPr>
+                <w:b/>
+                <w:bCs/>
+                <w:color w:val="FFFFFF"/>
+                <w:sz w:val="18"/>
+                <w:szCs w:val="18"/>
+              </w:rPr>
+              <w:t xml:space="preserve">Description</w:t>
+            </w:r>
+          </w:p>
+        </w:tc>
+      </w:tr>
+      <w:tr>
+        <w:tc>
+          <w:tcPr>
+            <w:shd w:color="F9FAFB" w:val="solid"/>
+            <w:tcMar>
+              <w:top w:type="dxa" w:w="60"/>
+              <w:left w:type="dxa" w:w="100"/>
+              <w:bottom w:type="dxa" w:w="60"/>
+              <w:right w:type="dxa" w:w="100"/>
+            </w:tcMar>
+          </w:tcPr>
+          <w:p>
+            <w:r>
+              <w:rPr>
+                <w:color w:val="1E1E2E"/>
+                <w:sz w:val="18"/>
+                <w:szCs w:val="18"/>
+              </w:rPr>
+              <w:t xml:space="preserve">`name`</w:t>
+            </w:r>
+          </w:p>
+        </w:tc>
+        <w:tc>
+          <w:tcPr>
+            <w:shd w:color="F9FAFB" w:val="solid"/>
+            <w:tcMar>
+              <w:top w:type="dxa" w:w="60"/>
+              <w:left w:type="dxa" w:w="100"/>
+              <w:bottom w:type="dxa" w:w="60"/>
+              <w:right w:type="dxa" w:w="100"/>
+            </w:tcMar>
+          </w:tcPr>
+          <w:p>
+            <w:r>
+              <w:rPr>
+                <w:color w:val="1E1E2E"/>
+                <w:sz w:val="18"/>
+                <w:szCs w:val="18"/>
+              </w:rPr>
+              <w:t xml:space="preserve">string</w:t>
+            </w:r>
+          </w:p>
+        </w:tc>
+        <w:tc>
+          <w:tcPr>
+            <w:shd w:color="F9FAFB" w:val="solid"/>
+            <w:tcMar>
+              <w:top w:type="dxa" w:w="60"/>
+              <w:left w:type="dxa" w:w="100"/>
+              <w:bottom w:type="dxa" w:w="60"/>
+              <w:right w:type="dxa" w:w="100"/>
+            </w:tcMar>
+          </w:tcPr>
+          <w:p>
+            <w:r>
+              <w:rPr>
+                <w:color w:val="1E1E2E"/>
+                <w:sz w:val="18"/>
+                <w:szCs w:val="18"/>
+              </w:rPr>
+              <w:t xml:space="preserve">Yes</w:t>
+            </w:r>
+          </w:p>
+        </w:tc>
+        <w:tc>
+          <w:tcPr>
+            <w:shd w:color="F9FAFB" w:val="solid"/>
+            <w:tcMar>
+              <w:top w:type="dxa" w:w="60"/>
+              <w:left w:type="dxa" w:w="100"/>
+              <w:bottom w:type="dxa" w:w="60"/>
+              <w:right w:type="dxa" w:w="100"/>
+            </w:tcMar>
+          </w:tcPr>
+          <w:p>
+            <w:r>
+              <w:rPr>
+                <w:color w:val="1E1E2E"/>
+                <w:sz w:val="18"/>
+                <w:szCs w:val="18"/>
+              </w:rPr>
+              <w:t xml:space="preserve">Service name</w:t>
+            </w:r>
+          </w:p>
+        </w:tc>
+      </w:tr>
+      <w:tr>
+        <w:tc>
+          <w:tcPr>
+            <w:shd w:color="FFFFFF" w:val="solid"/>
+            <w:tcMar>
+              <w:top w:type="dxa" w:w="60"/>
+              <w:left w:type="dxa" w:w="100"/>
+              <w:bottom w:type="dxa" w:w="60"/>
+              <w:right w:type="dxa" w:w="100"/>
+            </w:tcMar>
+          </w:tcPr>
+          <w:p>
+            <w:r>
+              <w:rPr>
+                <w:color w:val="1E1E2E"/>
+                <w:sz w:val="18"/>
+                <w:szCs w:val="18"/>
+              </w:rPr>
+              <w:t xml:space="preserve">`description`</w:t>
+            </w:r>
+          </w:p>
+        </w:tc>
+        <w:tc>
+          <w:tcPr>
+            <w:shd w:color="FFFFFF" w:val="solid"/>
+            <w:tcMar>
+              <w:top w:type="dxa" w:w="60"/>
+              <w:left w:type="dxa" w:w="100"/>
+              <w:bottom w:type="dxa" w:w="60"/>
+              <w:right w:type="dxa" w:w="100"/>
+            </w:tcMar>
+          </w:tcPr>
+          <w:p>
+            <w:r>
+              <w:rPr>
+                <w:color w:val="1E1E2E"/>
+                <w:sz w:val="18"/>
+                <w:szCs w:val="18"/>
+              </w:rPr>
+              <w:t xml:space="preserve">string</w:t>
+            </w:r>
+          </w:p>
+        </w:tc>
+        <w:tc>
+          <w:tcPr>
+            <w:shd w:color="FFFFFF" w:val="solid"/>
+            <w:tcMar>
+              <w:top w:type="dxa" w:w="60"/>
+              <w:left w:type="dxa" w:w="100"/>
+              <w:bottom w:type="dxa" w:w="60"/>
+              <w:right w:type="dxa" w:w="100"/>
+            </w:tcMar>
+          </w:tcPr>
+          <w:p>
+            <w:r>
+              <w:rPr>
+                <w:color w:val="1E1E2E"/>
+                <w:sz w:val="18"/>
+                <w:szCs w:val="18"/>
+              </w:rPr>
+              <w:t xml:space="preserve">No</w:t>
+            </w:r>
+          </w:p>
+        </w:tc>
+        <w:tc>
+          <w:tcPr>
+            <w:shd w:color="FFFFFF" w:val="solid"/>
+            <w:tcMar>
+              <w:top w:type="dxa" w:w="60"/>
+              <w:left w:type="dxa" w:w="100"/>
+              <w:bottom w:type="dxa" w:w="60"/>
+              <w:right w:type="dxa" w:w="100"/>
+            </w:tcMar>
+          </w:tcPr>
+          <w:p>
+            <w:r>
+              <w:rPr>
+                <w:color w:val="1E1E2E"/>
+                <w:sz w:val="18"/>
+                <w:szCs w:val="18"/>
+              </w:rPr>
+              <w:t xml:space="preserve">What the service does</w:t>
+            </w:r>
+          </w:p>
+        </w:tc>
+      </w:tr>
+      <w:tr>
+        <w:tc>
+          <w:tcPr>
+            <w:shd w:color="F9FAFB" w:val="solid"/>
+            <w:tcMar>
+              <w:top w:type="dxa" w:w="60"/>
+              <w:left w:type="dxa" w:w="100"/>
+              <w:bottom w:type="dxa" w:w="60"/>
+              <w:right w:type="dxa" w:w="100"/>
+            </w:tcMar>
+          </w:tcPr>
+          <w:p>
+            <w:r>
+              <w:rPr>
+                <w:color w:val="1E1E2E"/>
+                <w:sz w:val="18"/>
+                <w:szCs w:val="18"/>
+              </w:rPr>
+              <w:t xml:space="preserve">`url`</w:t>
+            </w:r>
+          </w:p>
+        </w:tc>
+        <w:tc>
+          <w:tcPr>
+            <w:shd w:color="F9FAFB" w:val="solid"/>
+            <w:tcMar>
+              <w:top w:type="dxa" w:w="60"/>
+              <w:left w:type="dxa" w:w="100"/>
+              <w:bottom w:type="dxa" w:w="60"/>
+              <w:right w:type="dxa" w:w="100"/>
+            </w:tcMar>
+          </w:tcPr>
+          <w:p>
+            <w:r>
+              <w:rPr>
+                <w:color w:val="1E1E2E"/>
+                <w:sz w:val="18"/>
+                <w:szCs w:val="18"/>
+              </w:rPr>
+              <w:t xml:space="preserve">string</w:t>
+            </w:r>
+          </w:p>
+        </w:tc>
+        <w:tc>
+          <w:tcPr>
+            <w:shd w:color="F9FAFB" w:val="solid"/>
+            <w:tcMar>
+              <w:top w:type="dxa" w:w="60"/>
+              <w:left w:type="dxa" w:w="100"/>
+              <w:bottom w:type="dxa" w:w="60"/>
+              <w:right w:type="dxa" w:w="100"/>
+            </w:tcMar>
+          </w:tcPr>
+          <w:p>
+            <w:r>
+              <w:rPr>
+                <w:color w:val="1E1E2E"/>
+                <w:sz w:val="18"/>
+                <w:szCs w:val="18"/>
+              </w:rPr>
+              <w:t xml:space="preserve">No</w:t>
+            </w:r>
+          </w:p>
+        </w:tc>
+        <w:tc>
+          <w:tcPr>
+            <w:shd w:color="F9FAFB" w:val="solid"/>
+            <w:tcMar>
+              <w:top w:type="dxa" w:w="60"/>
+              <w:left w:type="dxa" w:w="100"/>
+              <w:bottom w:type="dxa" w:w="60"/>
+              <w:right w:type="dxa" w:w="100"/>
+            </w:tcMar>
+          </w:tcPr>
+          <w:p>
+            <w:r>
+              <w:rPr>
+                <w:color w:val="1E1E2E"/>
+                <w:sz w:val="18"/>
+                <w:szCs w:val="18"/>
+              </w:rPr>
+              <w:t xml:space="preserve">Service URL</w:t>
+            </w:r>
+          </w:p>
+        </w:tc>
+      </w:tr>
+      <w:tr>
+        <w:tc>
+          <w:tcPr>
+            <w:shd w:color="FFFFFF" w:val="solid"/>
+            <w:tcMar>
+              <w:top w:type="dxa" w:w="60"/>
+              <w:left w:type="dxa" w:w="100"/>
+              <w:bottom w:type="dxa" w:w="60"/>
+              <w:right w:type="dxa" w:w="100"/>
+            </w:tcMar>
+          </w:tcPr>
+          <w:p>
+            <w:r>
+              <w:rPr>
+                <w:color w:val="1E1E2E"/>
+                <w:sz w:val="18"/>
+                <w:szCs w:val="18"/>
+              </w:rPr>
+              <w:t xml:space="preserve">`status`</w:t>
+            </w:r>
+          </w:p>
+        </w:tc>
+        <w:tc>
+          <w:tcPr>
+            <w:shd w:color="FFFFFF" w:val="solid"/>
+            <w:tcMar>
+              <w:top w:type="dxa" w:w="60"/>
+              <w:left w:type="dxa" w:w="100"/>
+              <w:bottom w:type="dxa" w:w="60"/>
+              <w:right w:type="dxa" w:w="100"/>
+            </w:tcMar>
+          </w:tcPr>
+          <w:p>
+            <w:r>
+              <w:rPr>
+                <w:color w:val="1E1E2E"/>
+                <w:sz w:val="18"/>
+                <w:szCs w:val="18"/>
+              </w:rPr>
+              <w:t xml:space="preserve">string</w:t>
+            </w:r>
+          </w:p>
+        </w:tc>
+        <w:tc>
+          <w:tcPr>
+            <w:shd w:color="FFFFFF" w:val="solid"/>
+            <w:tcMar>
+              <w:top w:type="dxa" w:w="60"/>
+              <w:left w:type="dxa" w:w="100"/>
+              <w:bottom w:type="dxa" w:w="60"/>
+              <w:right w:type="dxa" w:w="100"/>
+            </w:tcMar>
+          </w:tcPr>
+          <w:p>
+            <w:r>
+              <w:rPr>
+                <w:color w:val="1E1E2E"/>
+                <w:sz w:val="18"/>
+                <w:szCs w:val="18"/>
+              </w:rPr>
+              <w:t xml:space="preserve">No</w:t>
+            </w:r>
+          </w:p>
+        </w:tc>
+        <w:tc>
+          <w:tcPr>
+            <w:shd w:color="FFFFFF" w:val="solid"/>
+            <w:tcMar>
+              <w:top w:type="dxa" w:w="60"/>
+              <w:left w:type="dxa" w:w="100"/>
+              <w:bottom w:type="dxa" w:w="60"/>
+              <w:right w:type="dxa" w:w="100"/>
+            </w:tcMar>
+          </w:tcPr>
+          <w:p>
+            <w:r>
+              <w:rPr>
+                <w:color w:val="1E1E2E"/>
+                <w:sz w:val="18"/>
+                <w:szCs w:val="18"/>
+              </w:rPr>
+              <w:t xml:space="preserve">active | evaluating | cancelled</w:t>
+            </w:r>
+          </w:p>
+        </w:tc>
+      </w:tr>
+      <w:tr>
+        <w:tc>
+          <w:tcPr>
+            <w:shd w:color="F9FAFB" w:val="solid"/>
+            <w:tcMar>
+              <w:top w:type="dxa" w:w="60"/>
+              <w:left w:type="dxa" w:w="100"/>
+              <w:bottom w:type="dxa" w:w="60"/>
+              <w:right w:type="dxa" w:w="100"/>
+            </w:tcMar>
+          </w:tcPr>
+          <w:p>
+            <w:r>
+              <w:rPr>
+                <w:color w:val="1E1E2E"/>
+                <w:sz w:val="18"/>
+                <w:szCs w:val="18"/>
+              </w:rPr>
+              <w:t xml:space="preserve">`cost`</w:t>
+            </w:r>
+          </w:p>
+        </w:tc>
+        <w:tc>
+          <w:tcPr>
+            <w:shd w:color="F9FAFB" w:val="solid"/>
+            <w:tcMar>
+              <w:top w:type="dxa" w:w="60"/>
+              <w:left w:type="dxa" w:w="100"/>
+              <w:bottom w:type="dxa" w:w="60"/>
+              <w:right w:type="dxa" w:w="100"/>
+            </w:tcMar>
+          </w:tcPr>
+          <w:p>
+            <w:r>
+              <w:rPr>
+                <w:color w:val="1E1E2E"/>
+                <w:sz w:val="18"/>
+                <w:szCs w:val="18"/>
+              </w:rPr>
+              <w:t xml:space="preserve">string</w:t>
+            </w:r>
+          </w:p>
+        </w:tc>
+        <w:tc>
+          <w:tcPr>
+            <w:shd w:color="F9FAFB" w:val="solid"/>
+            <w:tcMar>
+              <w:top w:type="dxa" w:w="60"/>
+              <w:left w:type="dxa" w:w="100"/>
+              <w:bottom w:type="dxa" w:w="60"/>
+              <w:right w:type="dxa" w:w="100"/>
+            </w:tcMar>
+          </w:tcPr>
+          <w:p>
+            <w:r>
+              <w:rPr>
+                <w:color w:val="1E1E2E"/>
+                <w:sz w:val="18"/>
+                <w:szCs w:val="18"/>
+              </w:rPr>
+              <w:t xml:space="preserve">No</w:t>
+            </w:r>
+          </w:p>
+        </w:tc>
+        <w:tc>
+          <w:tcPr>
+            <w:shd w:color="F9FAFB" w:val="solid"/>
+            <w:tcMar>
+              <w:top w:type="dxa" w:w="60"/>
+              <w:left w:type="dxa" w:w="100"/>
+              <w:bottom w:type="dxa" w:w="60"/>
+              <w:right w:type="dxa" w:w="100"/>
+            </w:tcMar>
+          </w:tcPr>
+          <w:p>
+            <w:r>
+              <w:rPr>
+                <w:color w:val="1E1E2E"/>
+                <w:sz w:val="18"/>
+                <w:szCs w:val="18"/>
+              </w:rPr>
+              <w:t xml:space="preserve">Monthly cost or pricing</w:t>
+            </w:r>
+          </w:p>
+        </w:tc>
+      </w:tr>
+      <w:tr>
+        <w:tc>
+          <w:tcPr>
+            <w:shd w:color="FFFFFF" w:val="solid"/>
+            <w:tcMar>
+              <w:top w:type="dxa" w:w="60"/>
+              <w:left w:type="dxa" w:w="100"/>
+              <w:bottom w:type="dxa" w:w="60"/>
+              <w:right w:type="dxa" w:w="100"/>
+            </w:tcMar>
+          </w:tcPr>
+          <w:p>
+            <w:r>
+              <w:rPr>
+                <w:color w:val="1E1E2E"/>
+                <w:sz w:val="18"/>
+                <w:szCs w:val="18"/>
+              </w:rPr>
+              <w:t xml:space="preserve">`category`</w:t>
+            </w:r>
+          </w:p>
+        </w:tc>
+        <w:tc>
+          <w:tcPr>
+            <w:shd w:color="FFFFFF" w:val="solid"/>
+            <w:tcMar>
+              <w:top w:type="dxa" w:w="60"/>
+              <w:left w:type="dxa" w:w="100"/>
+              <w:bottom w:type="dxa" w:w="60"/>
+              <w:right w:type="dxa" w:w="100"/>
+            </w:tcMar>
+          </w:tcPr>
+          <w:p>
+            <w:r>
+              <w:rPr>
+                <w:color w:val="1E1E2E"/>
+                <w:sz w:val="18"/>
+                <w:szCs w:val="18"/>
+              </w:rPr>
+              <w:t xml:space="preserve">string</w:t>
+            </w:r>
+          </w:p>
+        </w:tc>
+        <w:tc>
+          <w:tcPr>
+            <w:shd w:color="FFFFFF" w:val="solid"/>
+            <w:tcMar>
+              <w:top w:type="dxa" w:w="60"/>
+              <w:left w:type="dxa" w:w="100"/>
+              <w:bottom w:type="dxa" w:w="60"/>
+              <w:right w:type="dxa" w:w="100"/>
+            </w:tcMar>
+          </w:tcPr>
+          <w:p>
+            <w:r>
+              <w:rPr>
+                <w:color w:val="1E1E2E"/>
+                <w:sz w:val="18"/>
+                <w:szCs w:val="18"/>
+              </w:rPr>
+              <w:t xml:space="preserve">No</w:t>
+            </w:r>
+          </w:p>
+        </w:tc>
+        <w:tc>
+          <w:tcPr>
+            <w:shd w:color="FFFFFF" w:val="solid"/>
+            <w:tcMar>
+              <w:top w:type="dxa" w:w="60"/>
+              <w:left w:type="dxa" w:w="100"/>
+              <w:bottom w:type="dxa" w:w="60"/>
+              <w:right w:type="dxa" w:w="100"/>
+            </w:tcMar>
+          </w:tcPr>
+          <w:p>
+            <w:r>
+              <w:rPr>
+                <w:color w:val="1E1E2E"/>
+                <w:sz w:val="18"/>
+                <w:szCs w:val="18"/>
+              </w:rPr>
+              <w:t xml:space="preserve">Grouping label</w:t>
+            </w:r>
+          </w:p>
+        </w:tc>
+      </w:tr>
+    </w:tbl>
+    <w:p>
+      <w:pPr>
+        <w:pBdr>
+          <w:bottom w:val="single" w:color="E5E7EB" w:sz="1"/>
+        </w:pBdr>
+        <w:spacing w:after="160" w:before="160"/>
+      </w:pPr>
+    </w:p>
+    <w:p>
+      <w:pPr>
+        <w:pStyle w:val="Heading1"/>
+        <w:spacing w:after="160" w:before="400"/>
+        <w:rPr>
+          <w:b/>
+          <w:bCs/>
+          <w:color w:val="1E1E2E"/>
+        </w:rPr>
+      </w:pPr>
+      <w:r>
+        <w:t xml:space="preserve">10. Portfolio</w:t>
+      </w:r>
+    </w:p>
+    <w:p>
+      <w:pPr>
+        <w:pStyle w:val="Heading2"/>
+        <w:spacing w:after="120" w:before="320"/>
+        <w:rPr>
+          <w:color w:val="6366F1"/>
+        </w:rPr>
+      </w:pPr>
+      <w:r>
+        <w:t xml:space="preserve">List / Create / Update / Delete</w:t>
+      </w:r>
+    </w:p>
+    <w:p>
+      <w:pPr>
+        <w:spacing w:after="80" w:before="160"/>
+      </w:pPr>
+      <w:r>
+        <w:rPr>
+          <w:b/>
+          <w:bCs/>
+          <w:color w:val="FFFFFF"/>
+          <w:sz w:val="18"/>
+          <w:szCs w:val="18"/>
+          <w:shd w:color="059669" w:val="solid"/>
+        </w:rPr>
+        <w:t xml:space="preserve"> GET </w:t>
+      </w:r>
+      <w:r>
+        <w:rPr>
+          <w:rFonts w:ascii="Courier New" w:cs="Courier New" w:eastAsia="Courier New" w:hAnsi="Courier New"/>
+          <w:color w:val="1E1E2E"/>
+          <w:sz w:val="20"/>
+          <w:szCs w:val="20"/>
+        </w:rPr>
+        <w:t xml:space="preserve">  /api/portfolio</w:t>
+      </w:r>
+    </w:p>
+    <w:p>
+      <w:pPr>
+        <w:spacing w:after="80" w:before="160"/>
+      </w:pPr>
+      <w:r>
+        <w:rPr>
+          <w:b/>
+          <w:bCs/>
+          <w:color w:val="FFFFFF"/>
+          <w:sz w:val="18"/>
+          <w:szCs w:val="18"/>
+          <w:shd w:color="2563EB" w:val="solid"/>
+        </w:rPr>
+        <w:t xml:space="preserve"> POST </w:t>
+      </w:r>
+      <w:r>
+        <w:rPr>
+          <w:rFonts w:ascii="Courier New" w:cs="Courier New" w:eastAsia="Courier New" w:hAnsi="Courier New"/>
+          <w:color w:val="1E1E2E"/>
+          <w:sz w:val="20"/>
+          <w:szCs w:val="20"/>
+        </w:rPr>
+        <w:t xml:space="preserve">  /api/portfolio</w:t>
+      </w:r>
+    </w:p>
+    <w:p>
+      <w:pPr>
+        <w:spacing w:after="80" w:before="160"/>
+      </w:pPr>
+      <w:r>
+        <w:rPr>
+          <w:b/>
+          <w:bCs/>
+          <w:color w:val="FFFFFF"/>
+          <w:sz w:val="18"/>
+          <w:szCs w:val="18"/>
+          <w:shd w:color="D97706" w:val="solid"/>
+        </w:rPr>
+        <w:t xml:space="preserve"> PATCH </w:t>
+      </w:r>
+      <w:r>
+        <w:rPr>
+          <w:rFonts w:ascii="Courier New" w:cs="Courier New" w:eastAsia="Courier New" w:hAnsi="Courier New"/>
+          <w:color w:val="1E1E2E"/>
+          <w:sz w:val="20"/>
+          <w:szCs w:val="20"/>
+        </w:rPr>
+        <w:t xml:space="preserve">  /api/portfolio/:id</w:t>
+      </w:r>
+    </w:p>
+    <w:p>
+      <w:pPr>
+        <w:spacing w:after="80" w:before="160"/>
+      </w:pPr>
+      <w:r>
+        <w:rPr>
+          <w:b/>
+          <w:bCs/>
+          <w:color w:val="FFFFFF"/>
+          <w:sz w:val="18"/>
+          <w:szCs w:val="18"/>
+          <w:shd w:color="DC2626" w:val="solid"/>
+        </w:rPr>
+        <w:t xml:space="preserve"> DELETE </w:t>
+      </w:r>
+      <w:r>
+        <w:rPr>
+          <w:rFonts w:ascii="Courier New" w:cs="Courier New" w:eastAsia="Courier New" w:hAnsi="Courier New"/>
+          <w:color w:val="1E1E2E"/>
+          <w:sz w:val="20"/>
+          <w:szCs w:val="20"/>
+        </w:rPr>
+        <w:t xml:space="preserve">  /api/portfolio/:id</w:t>
+      </w:r>
+    </w:p>
+    <w:tbl>
+      <w:tblPr>
+        <w:tblW w:type="pct" w:w="100%"/>
+        <w:tblBorders>
+          <w:top w:val="single" w:color="auto" w:sz="4"/>
+          <w:left w:val="single" w:color="auto" w:sz="4"/>
+          <w:bottom w:val="single" w:color="auto" w:sz="4"/>
+          <w:right w:val="single" w:color="auto" w:sz="4"/>
+          <w:insideH w:val="single" w:color="auto" w:sz="4"/>
+          <w:insideV w:val="single" w:color="auto" w:sz="4"/>
+        </w:tblBorders>
+      </w:tblPr>
+      <w:tblGrid>
+        <w:gridCol w:w="100"/>
+        <w:gridCol w:w="100"/>
+        <w:gridCol w:w="100"/>
+        <w:gridCol w:w="100"/>
+      </w:tblGrid>
+      <w:tr>
+        <w:trPr>
+          <w:tblHeader/>
+        </w:trPr>
+        <w:tc>
+          <w:tcPr>
+            <w:shd w:color="6366F1" w:val="solid"/>
+            <w:tcMar>
+              <w:top w:type="dxa" w:w="60"/>
+              <w:left w:type="dxa" w:w="100"/>
+              <w:bottom w:type="dxa" w:w="60"/>
+              <w:right w:type="dxa" w:w="100"/>
+            </w:tcMar>
+          </w:tcPr>
+          <w:p>
+            <w:r>
+              <w:rPr>
+                <w:b/>
+                <w:bCs/>
+                <w:color w:val="FFFFFF"/>
+                <w:sz w:val="18"/>
+                <w:szCs w:val="18"/>
+              </w:rPr>
+              <w:t xml:space="preserve">Field</w:t>
+            </w:r>
+          </w:p>
+        </w:tc>
+        <w:tc>
+          <w:tcPr>
+            <w:shd w:color="6366F1" w:val="solid"/>
+            <w:tcMar>
+              <w:top w:type="dxa" w:w="60"/>
+              <w:left w:type="dxa" w:w="100"/>
+              <w:bottom w:type="dxa" w:w="60"/>
+              <w:right w:type="dxa" w:w="100"/>
+            </w:tcMar>
+          </w:tcPr>
+          <w:p>
+            <w:r>
+              <w:rPr>
+                <w:b/>
+                <w:bCs/>
+                <w:color w:val="FFFFFF"/>
+                <w:sz w:val="18"/>
+                <w:szCs w:val="18"/>
+              </w:rPr>
+              <w:t xml:space="preserve">Type</w:t>
+            </w:r>
+          </w:p>
+        </w:tc>
+        <w:tc>
+          <w:tcPr>
+            <w:shd w:color="6366F1" w:val="solid"/>
+            <w:tcMar>
+              <w:top w:type="dxa" w:w="60"/>
+              <w:left w:type="dxa" w:w="100"/>
+              <w:bottom w:type="dxa" w:w="60"/>
+              <w:right w:type="dxa" w:w="100"/>
+            </w:tcMar>
+          </w:tcPr>
+          <w:p>
+            <w:r>
+              <w:rPr>
+                <w:b/>
+                <w:bCs/>
+                <w:color w:val="FFFFFF"/>
+                <w:sz w:val="18"/>
+                <w:szCs w:val="18"/>
+              </w:rPr>
+              <w:t xml:space="preserve">Required</w:t>
+            </w:r>
+          </w:p>
+        </w:tc>
+        <w:tc>
+          <w:tcPr>
+            <w:shd w:color="6366F1" w:val="solid"/>
+            <w:tcMar>
+              <w:top w:type="dxa" w:w="60"/>
+              <w:left w:type="dxa" w:w="100"/>
+              <w:bottom w:type="dxa" w:w="60"/>
+              <w:right w:type="dxa" w:w="100"/>
+            </w:tcMar>
+          </w:tcPr>
+          <w:p>
+            <w:r>
+              <w:rPr>
+                <w:b/>
+                <w:bCs/>
+                <w:color w:val="FFFFFF"/>
+                <w:sz w:val="18"/>
+                <w:szCs w:val="18"/>
+              </w:rPr>
+              <w:t xml:space="preserve">Description</w:t>
+            </w:r>
+          </w:p>
+        </w:tc>
+      </w:tr>
+      <w:tr>
+        <w:tc>
+          <w:tcPr>
+            <w:shd w:color="F9FAFB" w:val="solid"/>
+            <w:tcMar>
+              <w:top w:type="dxa" w:w="60"/>
+              <w:left w:type="dxa" w:w="100"/>
+              <w:bottom w:type="dxa" w:w="60"/>
+              <w:right w:type="dxa" w:w="100"/>
+            </w:tcMar>
+          </w:tcPr>
+          <w:p>
+            <w:r>
+              <w:rPr>
+                <w:color w:val="1E1E2E"/>
+                <w:sz w:val="18"/>
+                <w:szCs w:val="18"/>
+              </w:rPr>
+              <w:t xml:space="preserve">`title`</w:t>
+            </w:r>
+          </w:p>
+        </w:tc>
+        <w:tc>
+          <w:tcPr>
+            <w:shd w:color="F9FAFB" w:val="solid"/>
+            <w:tcMar>
+              <w:top w:type="dxa" w:w="60"/>
+              <w:left w:type="dxa" w:w="100"/>
+              <w:bottom w:type="dxa" w:w="60"/>
+              <w:right w:type="dxa" w:w="100"/>
+            </w:tcMar>
+          </w:tcPr>
+          <w:p>
+            <w:r>
+              <w:rPr>
+                <w:color w:val="1E1E2E"/>
+                <w:sz w:val="18"/>
+                <w:szCs w:val="18"/>
+              </w:rPr>
+              <w:t xml:space="preserve">string</w:t>
+            </w:r>
+          </w:p>
+        </w:tc>
+        <w:tc>
+          <w:tcPr>
+            <w:shd w:color="F9FAFB" w:val="solid"/>
+            <w:tcMar>
+              <w:top w:type="dxa" w:w="60"/>
+              <w:left w:type="dxa" w:w="100"/>
+              <w:bottom w:type="dxa" w:w="60"/>
+              <w:right w:type="dxa" w:w="100"/>
+            </w:tcMar>
+          </w:tcPr>
+          <w:p>
+            <w:r>
+              <w:rPr>
+                <w:color w:val="1E1E2E"/>
+                <w:sz w:val="18"/>
+                <w:szCs w:val="18"/>
+              </w:rPr>
+              <w:t xml:space="preserve">Yes</w:t>
+            </w:r>
+          </w:p>
+        </w:tc>
+        <w:tc>
+          <w:tcPr>
+            <w:shd w:color="F9FAFB" w:val="solid"/>
+            <w:tcMar>
+              <w:top w:type="dxa" w:w="60"/>
+              <w:left w:type="dxa" w:w="100"/>
+              <w:bottom w:type="dxa" w:w="60"/>
+              <w:right w:type="dxa" w:w="100"/>
+            </w:tcMar>
+          </w:tcPr>
+          <w:p>
+            <w:r>
+              <w:rPr>
+                <w:color w:val="1E1E2E"/>
+                <w:sz w:val="18"/>
+                <w:szCs w:val="18"/>
+              </w:rPr>
+              <w:t xml:space="preserve">Project title</w:t>
+            </w:r>
+          </w:p>
+        </w:tc>
+      </w:tr>
+      <w:tr>
+        <w:tc>
+          <w:tcPr>
+            <w:shd w:color="FFFFFF" w:val="solid"/>
+            <w:tcMar>
+              <w:top w:type="dxa" w:w="60"/>
+              <w:left w:type="dxa" w:w="100"/>
+              <w:bottom w:type="dxa" w:w="60"/>
+              <w:right w:type="dxa" w:w="100"/>
+            </w:tcMar>
+          </w:tcPr>
+          <w:p>
+            <w:r>
+              <w:rPr>
+                <w:color w:val="1E1E2E"/>
+                <w:sz w:val="18"/>
+                <w:szCs w:val="18"/>
+              </w:rPr>
+              <w:t xml:space="preserve">`description`</w:t>
+            </w:r>
+          </w:p>
+        </w:tc>
+        <w:tc>
+          <w:tcPr>
+            <w:shd w:color="FFFFFF" w:val="solid"/>
+            <w:tcMar>
+              <w:top w:type="dxa" w:w="60"/>
+              <w:left w:type="dxa" w:w="100"/>
+              <w:bottom w:type="dxa" w:w="60"/>
+              <w:right w:type="dxa" w:w="100"/>
+            </w:tcMar>
+          </w:tcPr>
+          <w:p>
+            <w:r>
+              <w:rPr>
+                <w:color w:val="1E1E2E"/>
+                <w:sz w:val="18"/>
+                <w:szCs w:val="18"/>
+              </w:rPr>
+              <w:t xml:space="preserve">string</w:t>
+            </w:r>
+          </w:p>
+        </w:tc>
+        <w:tc>
+          <w:tcPr>
+            <w:shd w:color="FFFFFF" w:val="solid"/>
+            <w:tcMar>
+              <w:top w:type="dxa" w:w="60"/>
+              <w:left w:type="dxa" w:w="100"/>
+              <w:bottom w:type="dxa" w:w="60"/>
+              <w:right w:type="dxa" w:w="100"/>
+            </w:tcMar>
+          </w:tcPr>
+          <w:p>
+            <w:r>
+              <w:rPr>
+                <w:color w:val="1E1E2E"/>
+                <w:sz w:val="18"/>
+                <w:szCs w:val="18"/>
+              </w:rPr>
+              <w:t xml:space="preserve">No</w:t>
+            </w:r>
+          </w:p>
+        </w:tc>
+        <w:tc>
+          <w:tcPr>
+            <w:shd w:color="FFFFFF" w:val="solid"/>
+            <w:tcMar>
+              <w:top w:type="dxa" w:w="60"/>
+              <w:left w:type="dxa" w:w="100"/>
+              <w:bottom w:type="dxa" w:w="60"/>
+              <w:right w:type="dxa" w:w="100"/>
+            </w:tcMar>
+          </w:tcPr>
+          <w:p>
+            <w:r>
+              <w:rPr>
+                <w:color w:val="1E1E2E"/>
+                <w:sz w:val="18"/>
+                <w:szCs w:val="18"/>
+              </w:rPr>
+              <w:t xml:space="preserve">Project description</w:t>
+            </w:r>
+          </w:p>
+        </w:tc>
+      </w:tr>
+      <w:tr>
+        <w:tc>
+          <w:tcPr>
+            <w:shd w:color="F9FAFB" w:val="solid"/>
+            <w:tcMar>
+              <w:top w:type="dxa" w:w="60"/>
+              <w:left w:type="dxa" w:w="100"/>
+              <w:bottom w:type="dxa" w:w="60"/>
+              <w:right w:type="dxa" w:w="100"/>
+            </w:tcMar>
+          </w:tcPr>
+          <w:p>
+            <w:r>
+              <w:rPr>
+                <w:color w:val="1E1E2E"/>
+                <w:sz w:val="18"/>
+                <w:szCs w:val="18"/>
+              </w:rPr>
+              <w:t xml:space="preserve">`url`</w:t>
+            </w:r>
+          </w:p>
+        </w:tc>
+        <w:tc>
+          <w:tcPr>
+            <w:shd w:color="F9FAFB" w:val="solid"/>
+            <w:tcMar>
+              <w:top w:type="dxa" w:w="60"/>
+              <w:left w:type="dxa" w:w="100"/>
+              <w:bottom w:type="dxa" w:w="60"/>
+              <w:right w:type="dxa" w:w="100"/>
+            </w:tcMar>
+          </w:tcPr>
+          <w:p>
+            <w:r>
+              <w:rPr>
+                <w:color w:val="1E1E2E"/>
+                <w:sz w:val="18"/>
+                <w:szCs w:val="18"/>
+              </w:rPr>
+              <w:t xml:space="preserve">string</w:t>
+            </w:r>
+          </w:p>
+        </w:tc>
+        <w:tc>
+          <w:tcPr>
+            <w:shd w:color="F9FAFB" w:val="solid"/>
+            <w:tcMar>
+              <w:top w:type="dxa" w:w="60"/>
+              <w:left w:type="dxa" w:w="100"/>
+              <w:bottom w:type="dxa" w:w="60"/>
+              <w:right w:type="dxa" w:w="100"/>
+            </w:tcMar>
+          </w:tcPr>
+          <w:p>
+            <w:r>
+              <w:rPr>
+                <w:color w:val="1E1E2E"/>
+                <w:sz w:val="18"/>
+                <w:szCs w:val="18"/>
+              </w:rPr>
+              <w:t xml:space="preserve">No</w:t>
+            </w:r>
+          </w:p>
+        </w:tc>
+        <w:tc>
+          <w:tcPr>
+            <w:shd w:color="F9FAFB" w:val="solid"/>
+            <w:tcMar>
+              <w:top w:type="dxa" w:w="60"/>
+              <w:left w:type="dxa" w:w="100"/>
+              <w:bottom w:type="dxa" w:w="60"/>
+              <w:right w:type="dxa" w:w="100"/>
+            </w:tcMar>
+          </w:tcPr>
+          <w:p>
+            <w:r>
+              <w:rPr>
+                <w:color w:val="1E1E2E"/>
+                <w:sz w:val="18"/>
+                <w:szCs w:val="18"/>
+              </w:rPr>
+              <w:t xml:space="preserve">Live URL</w:t>
+            </w:r>
+          </w:p>
+        </w:tc>
+      </w:tr>
+      <w:tr>
+        <w:tc>
+          <w:tcPr>
+            <w:shd w:color="FFFFFF" w:val="solid"/>
+            <w:tcMar>
+              <w:top w:type="dxa" w:w="60"/>
+              <w:left w:type="dxa" w:w="100"/>
+              <w:bottom w:type="dxa" w:w="60"/>
+              <w:right w:type="dxa" w:w="100"/>
+            </w:tcMar>
+          </w:tcPr>
+          <w:p>
+            <w:r>
+              <w:rPr>
+                <w:color w:val="1E1E2E"/>
+                <w:sz w:val="18"/>
+                <w:szCs w:val="18"/>
+              </w:rPr>
+              <w:t xml:space="preserve">`repoUrl`</w:t>
+            </w:r>
+          </w:p>
+        </w:tc>
+        <w:tc>
+          <w:tcPr>
+            <w:shd w:color="FFFFFF" w:val="solid"/>
+            <w:tcMar>
+              <w:top w:type="dxa" w:w="60"/>
+              <w:left w:type="dxa" w:w="100"/>
+              <w:bottom w:type="dxa" w:w="60"/>
+              <w:right w:type="dxa" w:w="100"/>
+            </w:tcMar>
+          </w:tcPr>
+          <w:p>
+            <w:r>
+              <w:rPr>
+                <w:color w:val="1E1E2E"/>
+                <w:sz w:val="18"/>
+                <w:szCs w:val="18"/>
+              </w:rPr>
+              <w:t xml:space="preserve">string</w:t>
+            </w:r>
+          </w:p>
+        </w:tc>
+        <w:tc>
+          <w:tcPr>
+            <w:shd w:color="FFFFFF" w:val="solid"/>
+            <w:tcMar>
+              <w:top w:type="dxa" w:w="60"/>
+              <w:left w:type="dxa" w:w="100"/>
+              <w:bottom w:type="dxa" w:w="60"/>
+              <w:right w:type="dxa" w:w="100"/>
+            </w:tcMar>
+          </w:tcPr>
+          <w:p>
+            <w:r>
+              <w:rPr>
+                <w:color w:val="1E1E2E"/>
+                <w:sz w:val="18"/>
+                <w:szCs w:val="18"/>
+              </w:rPr>
+              <w:t xml:space="preserve">No</w:t>
+            </w:r>
+          </w:p>
+        </w:tc>
+        <w:tc>
+          <w:tcPr>
+            <w:shd w:color="FFFFFF" w:val="solid"/>
+            <w:tcMar>
+              <w:top w:type="dxa" w:w="60"/>
+              <w:left w:type="dxa" w:w="100"/>
+              <w:bottom w:type="dxa" w:w="60"/>
+              <w:right w:type="dxa" w:w="100"/>
+            </w:tcMar>
+          </w:tcPr>
+          <w:p>
+            <w:r>
+              <w:rPr>
+                <w:color w:val="1E1E2E"/>
+                <w:sz w:val="18"/>
+                <w:szCs w:val="18"/>
+              </w:rPr>
+              <w:t xml:space="preserve">GitHub repo URL</w:t>
+            </w:r>
+          </w:p>
+        </w:tc>
+      </w:tr>
+      <w:tr>
+        <w:tc>
+          <w:tcPr>
+            <w:shd w:color="F9FAFB" w:val="solid"/>
+            <w:tcMar>
+              <w:top w:type="dxa" w:w="60"/>
+              <w:left w:type="dxa" w:w="100"/>
+              <w:bottom w:type="dxa" w:w="60"/>
+              <w:right w:type="dxa" w:w="100"/>
+            </w:tcMar>
+          </w:tcPr>
+          <w:p>
+            <w:r>
+              <w:rPr>
+                <w:color w:val="1E1E2E"/>
+                <w:sz w:val="18"/>
+                <w:szCs w:val="18"/>
+              </w:rPr>
+              <w:t xml:space="preserve">`skills`</w:t>
+            </w:r>
+          </w:p>
+        </w:tc>
+        <w:tc>
+          <w:tcPr>
+            <w:shd w:color="F9FAFB" w:val="solid"/>
+            <w:tcMar>
+              <w:top w:type="dxa" w:w="60"/>
+              <w:left w:type="dxa" w:w="100"/>
+              <w:bottom w:type="dxa" w:w="60"/>
+              <w:right w:type="dxa" w:w="100"/>
+            </w:tcMar>
+          </w:tcPr>
+          <w:p>
+            <w:r>
+              <w:rPr>
+                <w:color w:val="1E1E2E"/>
+                <w:sz w:val="18"/>
+                <w:szCs w:val="18"/>
+              </w:rPr>
+              <w:t xml:space="preserve">string</w:t>
+            </w:r>
+          </w:p>
+        </w:tc>
+        <w:tc>
+          <w:tcPr>
+            <w:shd w:color="F9FAFB" w:val="solid"/>
+            <w:tcMar>
+              <w:top w:type="dxa" w:w="60"/>
+              <w:left w:type="dxa" w:w="100"/>
+              <w:bottom w:type="dxa" w:w="60"/>
+              <w:right w:type="dxa" w:w="100"/>
+            </w:tcMar>
+          </w:tcPr>
+          <w:p>
+            <w:r>
+              <w:rPr>
+                <w:color w:val="1E1E2E"/>
+                <w:sz w:val="18"/>
+                <w:szCs w:val="18"/>
+              </w:rPr>
+              <w:t xml:space="preserve">No</w:t>
+            </w:r>
+          </w:p>
+        </w:tc>
+        <w:tc>
+          <w:tcPr>
+            <w:shd w:color="F9FAFB" w:val="solid"/>
+            <w:tcMar>
+              <w:top w:type="dxa" w:w="60"/>
+              <w:left w:type="dxa" w:w="100"/>
+              <w:bottom w:type="dxa" w:w="60"/>
+              <w:right w:type="dxa" w:w="100"/>
+            </w:tcMar>
+          </w:tcPr>
+          <w:p>
+            <w:r>
+              <w:rPr>
+                <w:color w:val="1E1E2E"/>
+                <w:sz w:val="18"/>
+                <w:szCs w:val="18"/>
+              </w:rPr>
+              <w:t xml:space="preserve">Comma-separated tech stack</w:t>
+            </w:r>
+          </w:p>
+        </w:tc>
+      </w:tr>
+    </w:tbl>
+    <w:p>
+      <w:pPr>
+        <w:pBdr>
+          <w:bottom w:val="single" w:color="E5E7EB" w:sz="1"/>
+        </w:pBdr>
+        <w:spacing w:after="160" w:before="160"/>
+      </w:pPr>
+    </w:p>
+    <w:p>
+      <w:pPr>
         <w:spacing w:before="400"/>
         <w:jc w:val="center"/>
       </w:pPr>
@@ -8513,7 +10036,7 @@
           <w:sz w:val="16"/>
           <w:szCs w:val="16"/>
         </w:rPr>
-        <w:t xml:space="preserve">Generated June 26, 2026 · Consultancy Dashboard Internal Docs</w:t>
+        <w:t xml:space="preserve">Generated July 11, 2026 · Consultancy Dashboard Internal Docs</w:t>
       </w:r>
     </w:p>
     <w:sectPr>

</xml_diff>